<commit_message>
Remove all emojis and decorative symbols from code, notebooks, and docs
</commit_message>
<xml_diff>
--- a/FSC22_Bioacoustic_AST_Research_Paper.docx
+++ b/FSC22_Bioacoustic_AST_Research_Paper.docx
@@ -89,14 +89,14 @@
                 <w:color w:val="1D4ED8"/>
                 <w:sz w:val="22"/>
               </w:rPr>
-              <w:t>🚀 Interactive Google Colab Notebook &amp; Code Access</w:t>
+              <w:t>Interactive Google Colab Notebook &amp; Code Access</w:t>
               <w:br/>
             </w:r>
             <w:r>
               <w:rPr>
                 <w:sz w:val="19"/>
               </w:rPr>
-              <w:t>To ensure complete reproducibility and open access, all experimental pipelines, source-disjoint partitioning algorithms, AST model fine-tuning code, multi-task consistency loss dynamics, evaluation tables, and colorful graphs are available in our master Google Colab Notebook:</w:t>
+              <w:t>To ensure complete reproducibility and open access, all experimental pipelines, source-disjoint partitioning algorithms, AST model fine-tuning code, multi-task consistency loss dynamics, evaluation tables, and colorful graphs are available in our Google Colab Notebook:</w:t>
               <w:br/>
             </w:r>
             <w:r>
@@ -105,7 +105,7 @@
                 <w:color w:val="2563EB"/>
                 <w:sz w:val="19"/>
               </w:rPr>
-              <w:t>🔗 ColabNotebook: https://colab.research.google.com/github/KanishkaM108/FSC22_Bioacoustic_AST/blob/main/FSC22_Bioacoustic_AST_Results_and_Evaluation.ipynb</w:t>
+              <w:t>ColabNotebook: https://colab.research.google.com/github/KanishkaM108/FSC22_Bioacoustic_AST/blob/main/FSC22_Bioacoustic_AST_Results_and_Evaluation.ipynb</w:t>
             </w:r>
           </w:p>
         </w:tc>

</xml_diff>